<commit_message>
docs: update project index and progress reporting
- Updated root Readme with accurate production versions (v1.0.5+6).
- Synchronized dependency versions (Flutter 3.8.1, secure_storage 10.0.0, etc.).
- Created professional documentation index in Doc/README.md.
- Updated academic progress report metadata.
</commit_message>
<xml_diff>
--- a/Doc/Academic/FYP2/Log/PROGRESS REPORT_FYP2.docx
+++ b/Doc/Academic/FYP2/Log/PROGRESS REPORT_FYP2.docx
@@ -823,15 +823,7 @@
       </w:r>
       <w:proofErr w:type="gramEnd"/>
       <w:r>
-        <w:t xml:space="preserve"> studies. Students od Malaysian Institute of Information Technology, </w:t>
-      </w:r>
-      <w:proofErr w:type="spellStart"/>
-      <w:r>
-        <w:t>Universiti</w:t>
-      </w:r>
-      <w:proofErr w:type="spellEnd"/>
-      <w:r>
-        <w:t xml:space="preserve"> Kuala Lumpur (MIIT </w:t>
+        <w:t xml:space="preserve"> studies. Students od Malaysian Institute of Information Technology, Universiti Kuala Lumpur (MIIT </w:t>
       </w:r>
       <w:proofErr w:type="spellStart"/>
       <w:r>
@@ -2291,6 +2283,12 @@
                 <w:rFonts w:ascii="Times New Roman"/>
               </w:rPr>
             </w:pPr>
+            <w:r>
+              <w:rPr>
+                <w:rFonts w:ascii="Times New Roman"/>
+              </w:rPr>
+              <w:t>8</w:t>
+            </w:r>
           </w:p>
         </w:tc>
         <w:tc>
@@ -2307,6 +2305,12 @@
                 <w:rFonts w:ascii="Times New Roman"/>
               </w:rPr>
             </w:pPr>
+            <w:r>
+              <w:rPr>
+                <w:rFonts w:ascii="Times New Roman"/>
+              </w:rPr>
+              <w:t>24/4/2026</w:t>
+            </w:r>
           </w:p>
         </w:tc>
         <w:tc>
@@ -2323,6 +2327,24 @@
                 <w:rFonts w:ascii="Times New Roman"/>
               </w:rPr>
             </w:pPr>
+            <w:r>
+              <w:rPr>
+                <w:rFonts w:ascii="Times New Roman"/>
+              </w:rPr>
+              <w:t xml:space="preserve">Chapter IV </w:t>
+            </w:r>
+            <w:r>
+              <w:rPr>
+                <w:rFonts w:ascii="Times New Roman"/>
+              </w:rPr>
+              <w:t>–</w:t>
+            </w:r>
+            <w:r>
+              <w:rPr>
+                <w:rFonts w:ascii="Times New Roman"/>
+              </w:rPr>
+              <w:t xml:space="preserve"> Prototyping / Product Development (Final Integration &amp; Testing Phase)</w:t>
+            </w:r>
           </w:p>
         </w:tc>
         <w:tc>
@@ -2339,6 +2361,12 @@
                 <w:rFonts w:ascii="Times New Roman"/>
               </w:rPr>
             </w:pPr>
+            <w:r>
+              <w:rPr>
+                <w:rFonts w:ascii="Times New Roman"/>
+              </w:rPr>
+              <w:t>Prototype completed, tested, and approved; focus on FYP poster and diagrams.</w:t>
+            </w:r>
           </w:p>
         </w:tc>
       </w:tr>
@@ -4160,6 +4188,13 @@
                                       <w:sz w:val="18"/>
                                     </w:rPr>
                                   </w:pPr>
+                                  <w:r>
+                                    <w:rPr>
+                                      <w:rFonts w:ascii="Times New Roman"/>
+                                      <w:sz w:val="18"/>
+                                    </w:rPr>
+                                    <w:t>MARCH 2026</w:t>
+                                  </w:r>
                                 </w:p>
                               </w:tc>
                             </w:tr>
@@ -4217,6 +4252,13 @@
                                       <w:sz w:val="18"/>
                                     </w:rPr>
                                   </w:pPr>
+                                  <w:r>
+                                    <w:rPr>
+                                      <w:rFonts w:ascii="Times New Roman"/>
+                                      <w:sz w:val="18"/>
+                                    </w:rPr>
+                                    <w:t>2</w:t>
+                                  </w:r>
                                 </w:p>
                               </w:tc>
                             </w:tr>
@@ -4306,6 +4348,13 @@
                                 <w:sz w:val="18"/>
                               </w:rPr>
                             </w:pPr>
+                            <w:r>
+                              <w:rPr>
+                                <w:rFonts w:ascii="Times New Roman"/>
+                                <w:sz w:val="18"/>
+                              </w:rPr>
+                              <w:t>MARCH 2026</w:t>
+                            </w:r>
                           </w:p>
                         </w:tc>
                       </w:tr>
@@ -4363,6 +4412,13 @@
                                 <w:sz w:val="18"/>
                               </w:rPr>
                             </w:pPr>
+                            <w:r>
+                              <w:rPr>
+                                <w:rFonts w:ascii="Times New Roman"/>
+                                <w:sz w:val="18"/>
+                              </w:rPr>
+                              <w:t>2</w:t>
+                            </w:r>
                           </w:p>
                         </w:tc>
                       </w:tr>
@@ -4482,6 +4538,13 @@
                                       <w:sz w:val="18"/>
                                     </w:rPr>
                                   </w:pPr>
+                                  <w:r>
+                                    <w:rPr>
+                                      <w:rFonts w:ascii="Times New Roman"/>
+                                      <w:sz w:val="18"/>
+                                    </w:rPr>
+                                    <w:t>8</w:t>
+                                  </w:r>
                                 </w:p>
                               </w:tc>
                             </w:tr>
@@ -4526,6 +4589,13 @@
                                       <w:sz w:val="18"/>
                                     </w:rPr>
                                   </w:pPr>
+                                  <w:r>
+                                    <w:rPr>
+                                      <w:rFonts w:ascii="Times New Roman"/>
+                                      <w:sz w:val="18"/>
+                                    </w:rPr>
+                                    <w:t>24/4/2026</w:t>
+                                  </w:r>
                                 </w:p>
                               </w:tc>
                             </w:tr>
@@ -4613,6 +4683,13 @@
                                 <w:sz w:val="18"/>
                               </w:rPr>
                             </w:pPr>
+                            <w:r>
+                              <w:rPr>
+                                <w:rFonts w:ascii="Times New Roman"/>
+                                <w:sz w:val="18"/>
+                              </w:rPr>
+                              <w:t>8</w:t>
+                            </w:r>
                           </w:p>
                         </w:tc>
                       </w:tr>
@@ -4657,6 +4734,13 @@
                                 <w:sz w:val="18"/>
                               </w:rPr>
                             </w:pPr>
+                            <w:r>
+                              <w:rPr>
+                                <w:rFonts w:ascii="Times New Roman"/>
+                                <w:sz w:val="18"/>
+                              </w:rPr>
+                              <w:t>24/4/2026</w:t>
+                            </w:r>
                           </w:p>
                         </w:tc>
                       </w:tr>
@@ -4786,10 +4870,65 @@
               <w:tabs>
                 <w:tab w:val="left" w:pos="724"/>
               </w:tabs>
-              <w:spacing w:before="2"/>
-              <w:ind w:left="724" w:right="659"/>
+              <w:spacing w:before="2" w:line="360" w:lineRule="auto"/>
+              <w:ind w:right="659"/>
               <w:jc w:val="both"/>
-            </w:pPr>
+              <w:rPr>
+                <w:rFonts w:ascii="Times New Roman" w:hAnsi="Times New Roman" w:cs="Times New Roman"/>
+              </w:rPr>
+            </w:pPr>
+            <w:r>
+              <w:rPr>
+                <w:rFonts w:ascii="Times New Roman" w:hAnsi="Times New Roman" w:cs="Times New Roman"/>
+              </w:rPr>
+              <w:t xml:space="preserve">I presented the </w:t>
+            </w:r>
+            <w:proofErr w:type="gramStart"/>
+            <w:r>
+              <w:rPr>
+                <w:rFonts w:ascii="Times New Roman" w:hAnsi="Times New Roman" w:cs="Times New Roman"/>
+              </w:rPr>
+              <w:t>completed</w:t>
+            </w:r>
+            <w:proofErr w:type="gramEnd"/>
+            <w:r>
+              <w:rPr>
+                <w:rFonts w:ascii="Times New Roman" w:hAnsi="Times New Roman" w:cs="Times New Roman"/>
+              </w:rPr>
+              <w:t xml:space="preserve"> </w:t>
+            </w:r>
+            <w:proofErr w:type="spellStart"/>
+            <w:r>
+              <w:rPr>
+                <w:rFonts w:ascii="Times New Roman" w:hAnsi="Times New Roman" w:cs="Times New Roman"/>
+              </w:rPr>
+              <w:t>sentriZK</w:t>
+            </w:r>
+            <w:proofErr w:type="spellEnd"/>
+            <w:r>
+              <w:rPr>
+                <w:rFonts w:ascii="Times New Roman" w:hAnsi="Times New Roman" w:cs="Times New Roman"/>
+              </w:rPr>
+              <w:t xml:space="preserve"> </w:t>
+            </w:r>
+            <w:r>
+              <w:rPr>
+                <w:rFonts w:ascii="Times New Roman" w:hAnsi="Times New Roman" w:cs="Times New Roman"/>
+              </w:rPr>
+              <w:t>(APK) via Microsoft Teams, including a full demonstration of system functionality and testing. I also showed the implementation of the Machine Learning</w:t>
+            </w:r>
+            <w:r>
+              <w:rPr>
+                <w:rFonts w:ascii="Times New Roman" w:hAnsi="Times New Roman" w:cs="Times New Roman"/>
+              </w:rPr>
+              <w:t xml:space="preserve"> </w:t>
+            </w:r>
+            <w:r>
+              <w:rPr>
+                <w:rFonts w:ascii="Times New Roman" w:hAnsi="Times New Roman" w:cs="Times New Roman"/>
+              </w:rPr>
+              <w:t>based threat detection module. The supervisor reviewed the system and confirmed that the progress is satisfactory.</w:t>
+            </w:r>
           </w:p>
         </w:tc>
       </w:tr>
@@ -4891,11 +5030,19 @@
           <w:p>
             <w:pPr>
               <w:pStyle w:val="TableParagraph"/>
+              <w:spacing w:line="360" w:lineRule="auto"/>
               <w:rPr>
                 <w:rFonts w:ascii="Times New Roman"/>
                 <w:sz w:val="20"/>
               </w:rPr>
             </w:pPr>
+            <w:r>
+              <w:rPr>
+                <w:rFonts w:ascii="Times New Roman"/>
+                <w:szCs w:val="24"/>
+              </w:rPr>
+              <w:t>I will focus on preparing the FYP poster, organizing and refining system diagrams, and ensuring clear presentation of the project.</w:t>
+            </w:r>
           </w:p>
         </w:tc>
         <w:tc>

</xml_diff>

<commit_message>
Final Commit for this fyp
</commit_message>
<xml_diff>
--- a/Doc/Academic/FYP2/Log/PROGRESS REPORT_FYP2.docx
+++ b/Doc/Academic/FYP2/Log/PROGRESS REPORT_FYP2.docx
@@ -815,15 +815,7 @@
         <w:jc w:val="both"/>
       </w:pPr>
       <w:r>
-        <w:t xml:space="preserve">The Final Year Project (FYP) is one of the most important phases of completing the undergraduate studies. Students od Malaysian Institute of Information Technology, Universiti Kuala Lumpur (MIIT </w:t>
-      </w:r>
-      <w:proofErr w:type="spellStart"/>
-      <w:r>
-        <w:t>UniKL</w:t>
-      </w:r>
-      <w:proofErr w:type="spellEnd"/>
-      <w:r>
-        <w:t>) are required to take up a project, whereby:</w:t>
+        <w:t>The Final Year Project (FYP) is one of the most important phases of completing the undergraduate studies. Students od Malaysian Institute of Information Technology, Universiti Kuala Lumpur (MIIT UniKL) are required to take up a project, whereby:</w:t>
       </w:r>
     </w:p>
     <w:p>
@@ -2392,11 +2384,13 @@
         <w:tc>
           <w:tcPr>
             <w:tcW w:w="2977" w:type="dxa"/>
+            <w:vAlign w:val="center"/>
           </w:tcPr>
           <w:p>
             <w:pPr>
               <w:pStyle w:val="TableParagraph"/>
               <w:ind w:left="4" w:right="721"/>
+              <w:jc w:val="center"/>
               <w:rPr>
                 <w:rFonts w:ascii="Times New Roman"/>
               </w:rPr>
@@ -2405,50 +2399,42 @@
               <w:rPr>
                 <w:rFonts w:ascii="Times New Roman"/>
               </w:rPr>
-              <w:t xml:space="preserve"> Meeting shown the poster and ask about </w:t>
-            </w:r>
-            <w:proofErr w:type="spellStart"/>
+              <w:t xml:space="preserve">Chapter V &amp; VI </w:t>
+            </w:r>
             <w:r>
               <w:rPr>
                 <w:rFonts w:ascii="Times New Roman"/>
               </w:rPr>
-              <w:t>prersenattiont</w:t>
-            </w:r>
-            <w:proofErr w:type="spellEnd"/>
+              <w:t>–</w:t>
+            </w:r>
             <w:r>
               <w:rPr>
                 <w:rFonts w:ascii="Times New Roman"/>
               </w:rPr>
-              <w:t xml:space="preserve"> </w:t>
-            </w:r>
-            <w:proofErr w:type="spellStart"/>
-            <w:r>
-              <w:rPr>
-                <w:rFonts w:ascii="Times New Roman"/>
-              </w:rPr>
-              <w:t>shi</w:t>
-            </w:r>
-            <w:proofErr w:type="spellEnd"/>
-            <w:r>
-              <w:rPr>
-                <w:rFonts w:ascii="Times New Roman"/>
-              </w:rPr>
-              <w:t xml:space="preserve"> week </w:t>
+              <w:t xml:space="preserve"> Testing and Results / Conclusion and Recommendation</w:t>
             </w:r>
           </w:p>
         </w:tc>
         <w:tc>
           <w:tcPr>
             <w:tcW w:w="2835" w:type="dxa"/>
+            <w:vAlign w:val="center"/>
           </w:tcPr>
           <w:p>
             <w:pPr>
               <w:pStyle w:val="TableParagraph"/>
               <w:ind w:left="5"/>
+              <w:jc w:val="center"/>
               <w:rPr>
                 <w:rFonts w:ascii="Times New Roman"/>
               </w:rPr>
             </w:pPr>
+            <w:r>
+              <w:rPr>
+                <w:rFonts w:ascii="Times New Roman"/>
+              </w:rPr>
+              <w:t>Presented the finalized FYP poster for review and discussed preparations and flow for the final presentation scheduled for this week.</w:t>
+            </w:r>
           </w:p>
         </w:tc>
       </w:tr>
@@ -2490,6 +2476,12 @@
                 <w:rFonts w:ascii="Times New Roman"/>
               </w:rPr>
             </w:pPr>
+            <w:r>
+              <w:rPr>
+                <w:rFonts w:ascii="Times New Roman"/>
+              </w:rPr>
+              <w:t>14</w:t>
+            </w:r>
           </w:p>
         </w:tc>
         <w:tc>
@@ -2501,10 +2493,17 @@
               <w:pStyle w:val="TableParagraph"/>
               <w:spacing w:line="251" w:lineRule="exact"/>
               <w:ind w:left="4"/>
+              <w:jc w:val="center"/>
               <w:rPr>
                 <w:rFonts w:ascii="Times New Roman"/>
               </w:rPr>
             </w:pPr>
+            <w:r>
+              <w:rPr>
+                <w:rFonts w:ascii="Times New Roman"/>
+              </w:rPr>
+              <w:t>31/5/2026</w:t>
+            </w:r>
           </w:p>
         </w:tc>
         <w:tc>
@@ -2516,10 +2515,29 @@
               <w:pStyle w:val="TableParagraph"/>
               <w:spacing w:line="251" w:lineRule="exact"/>
               <w:ind w:left="4" w:right="-15"/>
+              <w:jc w:val="center"/>
               <w:rPr>
                 <w:rFonts w:ascii="Times New Roman"/>
               </w:rPr>
             </w:pPr>
+            <w:r>
+              <w:rPr>
+                <w:rFonts w:ascii="Times New Roman"/>
+              </w:rPr>
+              <w:t xml:space="preserve">Chapter V &amp; VI </w:t>
+            </w:r>
+            <w:r>
+              <w:rPr>
+                <w:rFonts w:ascii="Times New Roman"/>
+              </w:rPr>
+              <w:t>–</w:t>
+            </w:r>
+            <w:r>
+              <w:rPr>
+                <w:rFonts w:ascii="Times New Roman"/>
+              </w:rPr>
+              <w:t xml:space="preserve"> Final Report Drafting</w:t>
+            </w:r>
           </w:p>
         </w:tc>
         <w:tc>
@@ -2530,10 +2548,17 @@
             <w:pPr>
               <w:pStyle w:val="TableParagraph"/>
               <w:ind w:left="5" w:right="104"/>
+              <w:jc w:val="center"/>
               <w:rPr>
                 <w:rFonts w:ascii="Times New Roman"/>
               </w:rPr>
             </w:pPr>
+            <w:r>
+              <w:rPr>
+                <w:rFonts w:ascii="Times New Roman"/>
+              </w:rPr>
+              <w:t>Consulted on the final report compilation. Received instructions on writing quality, avoiding AI-generated tones, and peer-reviewing the chapters.</w:t>
+            </w:r>
           </w:p>
         </w:tc>
       </w:tr>
@@ -2571,10 +2596,17 @@
           <w:p>
             <w:pPr>
               <w:pStyle w:val="TableParagraph"/>
+              <w:jc w:val="center"/>
               <w:rPr>
                 <w:rFonts w:ascii="Times New Roman"/>
               </w:rPr>
             </w:pPr>
+            <w:r>
+              <w:rPr>
+                <w:rFonts w:ascii="Times New Roman"/>
+              </w:rPr>
+              <w:t>16</w:t>
+            </w:r>
           </w:p>
         </w:tc>
         <w:tc>
@@ -2586,10 +2618,17 @@
               <w:pStyle w:val="TableParagraph"/>
               <w:spacing w:line="251" w:lineRule="exact"/>
               <w:ind w:left="4"/>
+              <w:jc w:val="center"/>
               <w:rPr>
                 <w:rFonts w:ascii="Times New Roman"/>
               </w:rPr>
             </w:pPr>
+            <w:r>
+              <w:rPr>
+                <w:rFonts w:ascii="Times New Roman"/>
+              </w:rPr>
+              <w:t>19/6/2026</w:t>
+            </w:r>
           </w:p>
         </w:tc>
         <w:tc>
@@ -2600,10 +2639,17 @@
             <w:pPr>
               <w:pStyle w:val="TableParagraph"/>
               <w:ind w:left="4" w:right="-15"/>
+              <w:jc w:val="center"/>
               <w:rPr>
                 <w:rFonts w:ascii="Times New Roman"/>
               </w:rPr>
             </w:pPr>
+            <w:r>
+              <w:rPr>
+                <w:rFonts w:ascii="Times New Roman"/>
+              </w:rPr>
+              <w:t>Final Report Submission &amp; Turnitin Check</w:t>
+            </w:r>
           </w:p>
         </w:tc>
         <w:tc>
@@ -2614,10 +2660,23 @@
             <w:pPr>
               <w:pStyle w:val="TableParagraph"/>
               <w:ind w:left="5"/>
+              <w:jc w:val="center"/>
               <w:rPr>
                 <w:rFonts w:ascii="Times New Roman"/>
               </w:rPr>
             </w:pPr>
+            <w:r>
+              <w:rPr>
+                <w:rFonts w:ascii="Times New Roman"/>
+              </w:rPr>
+              <w:t>A</w:t>
+            </w:r>
+            <w:r>
+              <w:rPr>
+                <w:rFonts w:ascii="Times New Roman"/>
+              </w:rPr>
+              <w:t>ddressed technical issues regarding Turnitin class enrollment. Supervisor manually added my email to ensure the final report could be checked for similarity.</w:t>
+            </w:r>
           </w:p>
         </w:tc>
       </w:tr>
@@ -4046,6 +4105,29 @@
             <w:tcW w:w="3401" w:type="dxa"/>
           </w:tcPr>
           <w:p>
+            <w:r>
+              <w:t xml:space="preserve">              </w:t>
+            </w:r>
+          </w:p>
+          <w:p/>
+          <w:p/>
+          <w:p/>
+          <w:p>
+            <w:r>
+              <w:t>………………………………….</w:t>
+            </w:r>
+          </w:p>
+          <w:p>
+            <w:r>
+              <w:t xml:space="preserve"> </w:t>
+            </w:r>
+          </w:p>
+          <w:p>
+            <w:r>
+              <w:t xml:space="preserve">    Dr. Delina Beh Mei Yin</w:t>
+            </w:r>
+          </w:p>
+          <w:p>
             <w:pPr>
               <w:pStyle w:val="TableParagraph"/>
               <w:rPr>
@@ -4879,19 +4961,11 @@
               </w:rPr>
               <w:t xml:space="preserve">I presented the completed </w:t>
             </w:r>
-            <w:proofErr w:type="spellStart"/>
             <w:r>
               <w:rPr>
                 <w:rFonts w:ascii="Times New Roman" w:hAnsi="Times New Roman" w:cs="Times New Roman"/>
               </w:rPr>
-              <w:t>sentriZK</w:t>
-            </w:r>
-            <w:proofErr w:type="spellEnd"/>
-            <w:r>
-              <w:rPr>
-                <w:rFonts w:ascii="Times New Roman" w:hAnsi="Times New Roman" w:cs="Times New Roman"/>
-              </w:rPr>
-              <w:t xml:space="preserve"> </w:t>
+              <w:t xml:space="preserve">sentriZK </w:t>
             </w:r>
             <w:r>
               <w:rPr>
@@ -5030,6 +5104,29 @@
             <w:tcW w:w="3162" w:type="dxa"/>
           </w:tcPr>
           <w:p>
+            <w:r>
+              <w:t xml:space="preserve">              </w:t>
+            </w:r>
+          </w:p>
+          <w:p/>
+          <w:p/>
+          <w:p/>
+          <w:p>
+            <w:r>
+              <w:t>………………………………….</w:t>
+            </w:r>
+          </w:p>
+          <w:p>
+            <w:r>
+              <w:t xml:space="preserve"> </w:t>
+            </w:r>
+          </w:p>
+          <w:p>
+            <w:r>
+              <w:t xml:space="preserve">    Dr. Delina Beh Mei Yin</w:t>
+            </w:r>
+          </w:p>
+          <w:p>
             <w:pPr>
               <w:pStyle w:val="TableParagraph"/>
               <w:rPr>
@@ -5072,7 +5169,7 @@
         <mc:AlternateContent>
           <mc:Choice Requires="wps">
             <w:drawing>
-              <wp:anchor distT="0" distB="0" distL="0" distR="0" simplePos="0" relativeHeight="251663872" behindDoc="1" locked="0" layoutInCell="1" allowOverlap="1" wp14:anchorId="34E3C8BB" wp14:editId="21987963">
+              <wp:anchor distT="0" distB="0" distL="0" distR="0" simplePos="0" relativeHeight="251663872" behindDoc="1" locked="0" layoutInCell="1" allowOverlap="1" wp14:anchorId="34E3C8BB" wp14:editId="67B9D2DB">
                 <wp:simplePos x="0" y="0"/>
                 <wp:positionH relativeFrom="page">
                   <wp:posOffset>896416</wp:posOffset>
@@ -5168,6 +5265,13 @@
                                       <w:sz w:val="18"/>
                                     </w:rPr>
                                   </w:pPr>
+                                  <w:r>
+                                    <w:rPr>
+                                      <w:rFonts w:ascii="Times New Roman"/>
+                                      <w:sz w:val="18"/>
+                                    </w:rPr>
+                                    <w:t>MARCH 2026</w:t>
+                                  </w:r>
                                 </w:p>
                               </w:tc>
                             </w:tr>
@@ -5225,6 +5329,13 @@
                                       <w:sz w:val="18"/>
                                     </w:rPr>
                                   </w:pPr>
+                                  <w:r>
+                                    <w:rPr>
+                                      <w:rFonts w:ascii="Times New Roman"/>
+                                      <w:sz w:val="18"/>
+                                    </w:rPr>
+                                    <w:t>3</w:t>
+                                  </w:r>
                                 </w:p>
                               </w:tc>
                             </w:tr>
@@ -5242,12 +5353,15 @@
                     </wps:wsp>
                   </a:graphicData>
                 </a:graphic>
+                <wp14:sizeRelH relativeFrom="margin">
+                  <wp14:pctWidth>0</wp14:pctWidth>
+                </wp14:sizeRelH>
               </wp:anchor>
             </w:drawing>
           </mc:Choice>
           <mc:Fallback>
             <w:pict>
-              <v:shape w14:anchorId="34E3C8BB" id="_x0000_s1030" type="#_x0000_t202" style="position:absolute;margin-left:70.6pt;margin-top:16.55pt;width:170.2pt;height:27.75pt;z-index:-251652608;visibility:visible;mso-wrap-style:square;mso-wrap-distance-left:0;mso-wrap-distance-top:0;mso-wrap-distance-right:0;mso-wrap-distance-bottom:0;mso-position-horizontal:absolute;mso-position-horizontal-relative:page;mso-position-vertical:absolute;mso-position-vertical-relative:text;v-text-anchor:top" o:gfxdata="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" filled="f" stroked="f">
+              <v:shape w14:anchorId="34E3C8BB" id="_x0000_s1030" type="#_x0000_t202" style="position:absolute;margin-left:70.6pt;margin-top:16.55pt;width:170.2pt;height:27.75pt;z-index:-251652608;visibility:visible;mso-wrap-style:square;mso-width-percent:0;mso-wrap-distance-left:0;mso-wrap-distance-top:0;mso-wrap-distance-right:0;mso-wrap-distance-bottom:0;mso-position-horizontal:absolute;mso-position-horizontal-relative:page;mso-position-vertical:absolute;mso-position-vertical-relative:text;mso-width-percent:0;mso-width-relative:margin;v-text-anchor:top" o:gfxdata="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" filled="f" stroked="f">
                 <v:textbox inset="0,0,0,0">
                   <w:txbxContent>
                     <w:tbl>
@@ -5314,6 +5428,13 @@
                                 <w:sz w:val="18"/>
                               </w:rPr>
                             </w:pPr>
+                            <w:r>
+                              <w:rPr>
+                                <w:rFonts w:ascii="Times New Roman"/>
+                                <w:sz w:val="18"/>
+                              </w:rPr>
+                              <w:t>MARCH 2026</w:t>
+                            </w:r>
                           </w:p>
                         </w:tc>
                       </w:tr>
@@ -5371,6 +5492,13 @@
                                 <w:sz w:val="18"/>
                               </w:rPr>
                             </w:pPr>
+                            <w:r>
+                              <w:rPr>
+                                <w:rFonts w:ascii="Times New Roman"/>
+                                <w:sz w:val="18"/>
+                              </w:rPr>
+                              <w:t>3</w:t>
+                            </w:r>
                           </w:p>
                         </w:tc>
                       </w:tr>
@@ -5490,6 +5618,13 @@
                                       <w:sz w:val="18"/>
                                     </w:rPr>
                                   </w:pPr>
+                                  <w:r>
+                                    <w:rPr>
+                                      <w:rFonts w:ascii="Times New Roman"/>
+                                      <w:sz w:val="18"/>
+                                    </w:rPr>
+                                    <w:t>11</w:t>
+                                  </w:r>
                                 </w:p>
                               </w:tc>
                             </w:tr>
@@ -5534,6 +5669,12 @@
                                       <w:sz w:val="18"/>
                                     </w:rPr>
                                   </w:pPr>
+                                  <w:r>
+                                    <w:rPr>
+                                      <w:rFonts w:ascii="Times New Roman"/>
+                                    </w:rPr>
+                                    <w:t>12/5/2026</w:t>
+                                  </w:r>
                                 </w:p>
                               </w:tc>
                             </w:tr>
@@ -5621,6 +5762,13 @@
                                 <w:sz w:val="18"/>
                               </w:rPr>
                             </w:pPr>
+                            <w:r>
+                              <w:rPr>
+                                <w:rFonts w:ascii="Times New Roman"/>
+                                <w:sz w:val="18"/>
+                              </w:rPr>
+                              <w:t>11</w:t>
+                            </w:r>
                           </w:p>
                         </w:tc>
                       </w:tr>
@@ -5665,6 +5813,12 @@
                                 <w:sz w:val="18"/>
                               </w:rPr>
                             </w:pPr>
+                            <w:r>
+                              <w:rPr>
+                                <w:rFonts w:ascii="Times New Roman"/>
+                              </w:rPr>
+                              <w:t>12/5/2026</w:t>
+                            </w:r>
                           </w:p>
                         </w:tc>
                       </w:tr>
@@ -5794,10 +5948,19 @@
               <w:tabs>
                 <w:tab w:val="left" w:pos="724"/>
               </w:tabs>
-              <w:spacing w:before="2"/>
-              <w:ind w:left="724" w:right="659"/>
+              <w:spacing w:before="2" w:line="360" w:lineRule="auto"/>
+              <w:ind w:right="659"/>
               <w:jc w:val="both"/>
+              <w:rPr>
+                <w:rFonts w:ascii="Times New Roman" w:hAnsi="Times New Roman" w:cs="Times New Roman"/>
+              </w:rPr>
             </w:pPr>
+            <w:r>
+              <w:rPr>
+                <w:rFonts w:ascii="Times New Roman" w:hAnsi="Times New Roman" w:cs="Times New Roman"/>
+              </w:rPr>
+              <w:t>I presented the finalized FYP poster for the SentriZK project to my supervisor for review. We discussed the key talking points and presentation flow for the final evaluation happening this week. The supervisor provided constructive feedback on how to best highlight the Zero-Knowledge Proof implementation and the Machine Learning threat detection module during the live demonstration to the panel.</w:t>
+            </w:r>
           </w:p>
         </w:tc>
       </w:tr>
@@ -5897,17 +6060,48 @@
           <w:p>
             <w:pPr>
               <w:pStyle w:val="TableParagraph"/>
+              <w:spacing w:line="360" w:lineRule="auto"/>
               <w:rPr>
                 <w:rFonts w:ascii="Times New Roman"/>
                 <w:sz w:val="20"/>
               </w:rPr>
             </w:pPr>
+            <w:r>
+              <w:rPr>
+                <w:rFonts w:ascii="Times New Roman"/>
+                <w:szCs w:val="24"/>
+              </w:rPr>
+              <w:t>I will refine the presentation slides based on the supervisor's feedback, rehearse the system demonstration, and ensure all final documentation is ready for the upcoming FYP presentation session.</w:t>
+            </w:r>
           </w:p>
         </w:tc>
         <w:tc>
           <w:tcPr>
             <w:tcW w:w="3162" w:type="dxa"/>
           </w:tcPr>
+          <w:p>
+            <w:r>
+              <w:t xml:space="preserve">              </w:t>
+            </w:r>
+          </w:p>
+          <w:p/>
+          <w:p/>
+          <w:p/>
+          <w:p>
+            <w:r>
+              <w:t>………………………………….</w:t>
+            </w:r>
+          </w:p>
+          <w:p>
+            <w:r>
+              <w:t xml:space="preserve"> </w:t>
+            </w:r>
+          </w:p>
+          <w:p>
+            <w:r>
+              <w:t xml:space="preserve">    Dr. Delina Beh Mei Yin</w:t>
+            </w:r>
+          </w:p>
           <w:p>
             <w:pPr>
               <w:pStyle w:val="TableParagraph"/>
@@ -6047,6 +6241,13 @@
                                       <w:sz w:val="18"/>
                                     </w:rPr>
                                   </w:pPr>
+                                  <w:r>
+                                    <w:rPr>
+                                      <w:rFonts w:ascii="Times New Roman"/>
+                                      <w:sz w:val="18"/>
+                                    </w:rPr>
+                                    <w:t>MARCH 2026</w:t>
+                                  </w:r>
                                 </w:p>
                               </w:tc>
                             </w:tr>
@@ -6104,6 +6305,13 @@
                                       <w:sz w:val="18"/>
                                     </w:rPr>
                                   </w:pPr>
+                                  <w:r>
+                                    <w:rPr>
+                                      <w:rFonts w:ascii="Times New Roman"/>
+                                      <w:sz w:val="18"/>
+                                    </w:rPr>
+                                    <w:t>4</w:t>
+                                  </w:r>
                                 </w:p>
                               </w:tc>
                             </w:tr>
@@ -6193,6 +6401,13 @@
                                 <w:sz w:val="18"/>
                               </w:rPr>
                             </w:pPr>
+                            <w:r>
+                              <w:rPr>
+                                <w:rFonts w:ascii="Times New Roman"/>
+                                <w:sz w:val="18"/>
+                              </w:rPr>
+                              <w:t>MARCH 2026</w:t>
+                            </w:r>
                           </w:p>
                         </w:tc>
                       </w:tr>
@@ -6250,6 +6465,13 @@
                                 <w:sz w:val="18"/>
                               </w:rPr>
                             </w:pPr>
+                            <w:r>
+                              <w:rPr>
+                                <w:rFonts w:ascii="Times New Roman"/>
+                                <w:sz w:val="18"/>
+                              </w:rPr>
+                              <w:t>4</w:t>
+                            </w:r>
                           </w:p>
                         </w:tc>
                       </w:tr>
@@ -6369,6 +6591,13 @@
                                       <w:sz w:val="18"/>
                                     </w:rPr>
                                   </w:pPr>
+                                  <w:r>
+                                    <w:rPr>
+                                      <w:rFonts w:ascii="Times New Roman"/>
+                                      <w:sz w:val="18"/>
+                                    </w:rPr>
+                                    <w:t>14</w:t>
+                                  </w:r>
                                 </w:p>
                               </w:tc>
                             </w:tr>
@@ -6413,6 +6642,13 @@
                                       <w:sz w:val="18"/>
                                     </w:rPr>
                                   </w:pPr>
+                                  <w:r>
+                                    <w:rPr>
+                                      <w:rFonts w:ascii="Times New Roman"/>
+                                      <w:sz w:val="18"/>
+                                    </w:rPr>
+                                    <w:t>31/5/2026</w:t>
+                                  </w:r>
                                 </w:p>
                               </w:tc>
                             </w:tr>
@@ -6500,6 +6736,13 @@
                                 <w:sz w:val="18"/>
                               </w:rPr>
                             </w:pPr>
+                            <w:r>
+                              <w:rPr>
+                                <w:rFonts w:ascii="Times New Roman"/>
+                                <w:sz w:val="18"/>
+                              </w:rPr>
+                              <w:t>14</w:t>
+                            </w:r>
                           </w:p>
                         </w:tc>
                       </w:tr>
@@ -6544,6 +6787,13 @@
                                 <w:sz w:val="18"/>
                               </w:rPr>
                             </w:pPr>
+                            <w:r>
+                              <w:rPr>
+                                <w:rFonts w:ascii="Times New Roman"/>
+                                <w:sz w:val="18"/>
+                              </w:rPr>
+                              <w:t>31/5/2026</w:t>
+                            </w:r>
                           </w:p>
                         </w:tc>
                       </w:tr>
@@ -6673,10 +6923,19 @@
               <w:tabs>
                 <w:tab w:val="left" w:pos="724"/>
               </w:tabs>
-              <w:spacing w:before="2"/>
-              <w:ind w:left="724" w:right="659"/>
+              <w:spacing w:before="2" w:line="360" w:lineRule="auto"/>
+              <w:ind w:right="659"/>
               <w:jc w:val="both"/>
+              <w:rPr>
+                <w:rFonts w:ascii="Times New Roman" w:hAnsi="Times New Roman" w:cs="Times New Roman"/>
+              </w:rPr>
             </w:pPr>
+            <w:r>
+              <w:rPr>
+                <w:rFonts w:ascii="Times New Roman" w:hAnsi="Times New Roman" w:cs="Times New Roman"/>
+              </w:rPr>
+              <w:t>I consulted my supervisor regarding the progress of my final report compilation. The supervisor advised me to ensure the writing flows naturally and avoids excessive AI-generated phrasing. I was also instructed to cross-check and peer-review my written chapters to ensure clarity and authenticity before the final submission.</w:t>
+            </w:r>
           </w:p>
         </w:tc>
       </w:tr>
@@ -6776,11 +7035,19 @@
           <w:p>
             <w:pPr>
               <w:pStyle w:val="TableParagraph"/>
+              <w:spacing w:line="360" w:lineRule="auto"/>
               <w:rPr>
                 <w:rFonts w:ascii="Times New Roman"/>
                 <w:sz w:val="20"/>
               </w:rPr>
             </w:pPr>
+            <w:r>
+              <w:rPr>
+                <w:rFonts w:ascii="Times New Roman"/>
+                <w:szCs w:val="24"/>
+              </w:rPr>
+              <w:t>I will finalize the writing for all chapters, conduct a peer review of the report to refine the language, and prepare the document for the upcoming Turnitin similarity check.</w:t>
+            </w:r>
           </w:p>
         </w:tc>
         <w:tc>
@@ -6788,22 +7055,27 @@
             <w:tcW w:w="3162" w:type="dxa"/>
           </w:tcPr>
           <w:p>
-            <w:pPr>
-              <w:pStyle w:val="TableParagraph"/>
-              <w:rPr>
-                <w:rFonts w:ascii="Times New Roman"/>
-                <w:sz w:val="20"/>
-              </w:rPr>
-            </w:pPr>
-          </w:p>
-          <w:p>
-            <w:pPr>
-              <w:pStyle w:val="TableParagraph"/>
-              <w:rPr>
-                <w:rFonts w:ascii="Times New Roman"/>
-                <w:sz w:val="20"/>
-              </w:rPr>
-            </w:pPr>
+            <w:r>
+              <w:t xml:space="preserve">              </w:t>
+            </w:r>
+          </w:p>
+          <w:p/>
+          <w:p/>
+          <w:p/>
+          <w:p>
+            <w:r>
+              <w:t>………………………………….</w:t>
+            </w:r>
+          </w:p>
+          <w:p>
+            <w:r>
+              <w:t xml:space="preserve"> </w:t>
+            </w:r>
+          </w:p>
+          <w:p>
+            <w:r>
+              <w:t xml:space="preserve">    Dr. Delina Beh Mei Yin</w:t>
+            </w:r>
           </w:p>
           <w:p>
             <w:pPr>
@@ -6944,6 +7216,13 @@
                                       <w:sz w:val="18"/>
                                     </w:rPr>
                                   </w:pPr>
+                                  <w:r>
+                                    <w:rPr>
+                                      <w:rFonts w:ascii="Times New Roman"/>
+                                      <w:sz w:val="18"/>
+                                    </w:rPr>
+                                    <w:t>MARCH 2026</w:t>
+                                  </w:r>
                                 </w:p>
                               </w:tc>
                             </w:tr>
@@ -7001,6 +7280,13 @@
                                       <w:sz w:val="18"/>
                                     </w:rPr>
                                   </w:pPr>
+                                  <w:r>
+                                    <w:rPr>
+                                      <w:rFonts w:ascii="Times New Roman"/>
+                                      <w:sz w:val="18"/>
+                                    </w:rPr>
+                                    <w:t>5</w:t>
+                                  </w:r>
                                 </w:p>
                               </w:tc>
                             </w:tr>
@@ -7090,6 +7376,13 @@
                                 <w:sz w:val="18"/>
                               </w:rPr>
                             </w:pPr>
+                            <w:r>
+                              <w:rPr>
+                                <w:rFonts w:ascii="Times New Roman"/>
+                                <w:sz w:val="18"/>
+                              </w:rPr>
+                              <w:t>MARCH 2026</w:t>
+                            </w:r>
                           </w:p>
                         </w:tc>
                       </w:tr>
@@ -7147,6 +7440,13 @@
                                 <w:sz w:val="18"/>
                               </w:rPr>
                             </w:pPr>
+                            <w:r>
+                              <w:rPr>
+                                <w:rFonts w:ascii="Times New Roman"/>
+                                <w:sz w:val="18"/>
+                              </w:rPr>
+                              <w:t>5</w:t>
+                            </w:r>
                           </w:p>
                         </w:tc>
                       </w:tr>
@@ -7266,6 +7566,13 @@
                                       <w:sz w:val="18"/>
                                     </w:rPr>
                                   </w:pPr>
+                                  <w:r>
+                                    <w:rPr>
+                                      <w:rFonts w:ascii="Times New Roman"/>
+                                      <w:sz w:val="18"/>
+                                    </w:rPr>
+                                    <w:t>16</w:t>
+                                  </w:r>
                                 </w:p>
                               </w:tc>
                             </w:tr>
@@ -7310,6 +7617,13 @@
                                       <w:sz w:val="18"/>
                                     </w:rPr>
                                   </w:pPr>
+                                  <w:r>
+                                    <w:rPr>
+                                      <w:rFonts w:ascii="Times New Roman"/>
+                                      <w:sz w:val="18"/>
+                                    </w:rPr>
+                                    <w:t>19/6/2026</w:t>
+                                  </w:r>
                                 </w:p>
                               </w:tc>
                             </w:tr>
@@ -7397,6 +7711,13 @@
                                 <w:sz w:val="18"/>
                               </w:rPr>
                             </w:pPr>
+                            <w:r>
+                              <w:rPr>
+                                <w:rFonts w:ascii="Times New Roman"/>
+                                <w:sz w:val="18"/>
+                              </w:rPr>
+                              <w:t>16</w:t>
+                            </w:r>
                           </w:p>
                         </w:tc>
                       </w:tr>
@@ -7441,6 +7762,13 @@
                                 <w:sz w:val="18"/>
                               </w:rPr>
                             </w:pPr>
+                            <w:r>
+                              <w:rPr>
+                                <w:rFonts w:ascii="Times New Roman"/>
+                                <w:sz w:val="18"/>
+                              </w:rPr>
+                              <w:t>19/6/2026</w:t>
+                            </w:r>
                           </w:p>
                         </w:tc>
                       </w:tr>
@@ -7570,10 +7898,19 @@
               <w:tabs>
                 <w:tab w:val="left" w:pos="724"/>
               </w:tabs>
-              <w:spacing w:before="2"/>
-              <w:ind w:left="724" w:right="659"/>
+              <w:spacing w:before="2" w:line="360" w:lineRule="auto"/>
+              <w:ind w:right="659"/>
               <w:jc w:val="both"/>
+              <w:rPr>
+                <w:rFonts w:ascii="Times New Roman" w:hAnsi="Times New Roman" w:cs="Times New Roman"/>
+              </w:rPr>
             </w:pPr>
+            <w:r>
+              <w:rPr>
+                <w:rFonts w:ascii="Times New Roman" w:hAnsi="Times New Roman" w:cs="Times New Roman"/>
+              </w:rPr>
+              <w:t>I engaged with my supervisor to resolve access issues with the Turnitin submission link. After encountering a student limit error in the initial class, the supervisor manually enrolled my email into the system. This allows me to successfully upload my final report for the required similarity and plagiarism check.</w:t>
+            </w:r>
           </w:p>
         </w:tc>
       </w:tr>
@@ -7673,17 +8010,48 @@
           <w:p>
             <w:pPr>
               <w:pStyle w:val="TableParagraph"/>
+              <w:spacing w:line="360" w:lineRule="auto"/>
               <w:rPr>
                 <w:rFonts w:ascii="Times New Roman"/>
                 <w:sz w:val="20"/>
               </w:rPr>
             </w:pPr>
+            <w:r>
+              <w:rPr>
+                <w:rFonts w:ascii="Times New Roman"/>
+                <w:szCs w:val="24"/>
+              </w:rPr>
+              <w:t>I will upload my completed FYP2 final report to Turnitin, ensure the similarity score meets the university's requirements, and complete the final submission process.</w:t>
+            </w:r>
           </w:p>
         </w:tc>
         <w:tc>
           <w:tcPr>
             <w:tcW w:w="3162" w:type="dxa"/>
           </w:tcPr>
+          <w:p>
+            <w:r>
+              <w:t xml:space="preserve">              </w:t>
+            </w:r>
+          </w:p>
+          <w:p/>
+          <w:p/>
+          <w:p/>
+          <w:p>
+            <w:r>
+              <w:t>………………………………….</w:t>
+            </w:r>
+          </w:p>
+          <w:p>
+            <w:r>
+              <w:t xml:space="preserve"> </w:t>
+            </w:r>
+          </w:p>
+          <w:p>
+            <w:r>
+              <w:t xml:space="preserve">    Dr. Delina Beh Mei Yin</w:t>
+            </w:r>
+          </w:p>
           <w:p>
             <w:pPr>
               <w:pStyle w:val="TableParagraph"/>

</xml_diff>